<commit_message>
meta: reference doc — uniform 12pt; ALL CAPS section headings (Heading1)
Per analyst: Title/Heading1/Heading2/Heading3 set to 12pt (body was already 12pt),
so the whole manuscript is one size. Added all-caps display to Heading1 so top-level
section headings render METHODS / RESULTS / etc. without changing the markdown source.
Subheadings (Heading2) left title case.
</commit_message>
<xml_diff>
--- a/pandoc-reference-manuscript.docx
+++ b/pandoc-reference-manuscript.docx
@@ -608,8 +608,8 @@
       <w:rFonts w:asciiTheme="majorHAnsi" w:eastAsiaTheme="majorEastAsia" w:hAnsiTheme="majorHAnsi" w:cstheme="majorBidi"/>
       <w:b/>
       <w:bCs/>
-      <w:sz w:val="36"/>
-      <w:szCs w:val="36"/>
+      <w:sz w:val="24"/>
+      <w:szCs w:val="24"/>
       <w:color w:val="000000"/>
     </w:rPr>
   </w:style>
@@ -707,11 +707,12 @@
       <w:outlineLvl w:val="0"/>
     </w:pPr>
     <w:rPr>
+      <w:caps/>
       <w:rFonts w:asciiTheme="majorHAnsi" w:eastAsiaTheme="majorEastAsia" w:hAnsiTheme="majorHAnsi" w:cstheme="majorBidi"/>
       <w:b/>
       <w:bCs/>
-      <w:sz w:val="32"/>
-      <w:szCs w:val="32"/>
+      <w:sz w:val="24"/>
+      <w:szCs w:val="24"/>
       <w:color w:val="000000"/>
     </w:rPr>
   </w:style>
@@ -732,8 +733,8 @@
       <w:rFonts w:asciiTheme="majorHAnsi" w:eastAsiaTheme="majorEastAsia" w:hAnsiTheme="majorHAnsi" w:cstheme="majorBidi"/>
       <w:b/>
       <w:bCs/>
-      <w:sz w:val="28"/>
-      <w:szCs w:val="28"/>
+      <w:sz w:val="24"/>
+      <w:szCs w:val="24"/>
       <w:color w:val="000000"/>
     </w:rPr>
   </w:style>

</xml_diff>